<commit_message>
test/docs: 최종 acceptance 보강 (Workflow 14단계 Export, 기존 DB 업그레이드 테스트, README 갱신)
Co-Authored-By: Claude Sonnet 5.5 <noreply@anthropic.com>
</commit_message>
<xml_diff>
--- a/docs-word/13-개발_로드맵_완료기준서.docx
+++ b/docs-word/13-개발_로드맵_완료기준서.docx
@@ -3169,6 +3169,57 @@
       </w:r>
     </w:p>
     <w:p>
+      <w:pPr>
+        <w:pStyle w:val="ListBullet"/>
+      </w:pPr>
+      <w:r>
+        <w:rPr>
+          <w:rFonts w:ascii="Arial" w:hAnsi="Arial" w:eastAsia="Malgun Gothic" w:cs="Malgun Gothic"/>
+          <w:color w:val="000000"/>
+          <w:sz w:val="22"/>
+          <w:lang w:eastAsia="ko-KR"/>
+        </w:rPr>
+        <w:t xml:space="preserve">§27 최종 검증(v2.0 이후 보강): 핵심 Workflow E2E가 14단계 </w:t>
+      </w:r>
+      <w:r>
+        <w:rPr>
+          <w:rFonts w:ascii="Arial" w:hAnsi="Arial" w:eastAsia="Malgun Gothic" w:cs="Malgun Gothic"/>
+          <w:b/>
+          <w:color w:val="000000"/>
+          <w:sz w:val="22"/>
+          <w:lang w:eastAsia="ko-KR"/>
+        </w:rPr>
+        <w:t>전부</w:t>
+      </w:r>
+      <w:r>
+        <w:rPr>
+          <w:rFonts w:ascii="Arial" w:hAnsi="Arial" w:eastAsia="Malgun Gothic" w:cs="Malgun Gothic"/>
+          <w:color w:val="000000"/>
+          <w:sz w:val="22"/>
+          <w:lang w:eastAsia="ko-KR"/>
+        </w:rPr>
+        <w:t xml:space="preserve">(14번 Export 포함 — 화면에서 내보내 ZIP을 풀어 Node 8개·Snippet 원문·관계 9개의 종류/방향/양 끝 존재·manifest checksum을 검사)를 따라가고, </w:t>
+      </w:r>
+      <w:r>
+        <w:rPr>
+          <w:rFonts w:ascii="Menlo" w:hAnsi="Menlo" w:eastAsia="Menlo" w:cs="Menlo"/>
+          <w:color w:val="000000"/>
+          <w:sz w:val="21"/>
+          <w:lang w:eastAsia="ko-KR"/>
+        </w:rPr>
+        <w:t>FlywayUpgradeTest</w:t>
+      </w:r>
+      <w:r>
+        <w:rPr>
+          <w:rFonts w:ascii="Arial" w:hAnsi="Arial" w:eastAsia="Malgun Gothic" w:cs="Malgun Gothic"/>
+          <w:color w:val="000000"/>
+          <w:sz w:val="22"/>
+          <w:lang w:eastAsia="ko-KR"/>
+        </w:rPr>
+        <w:t>가 "기존 database upgrade"(V10 데이터가 있는 DB를 최신으로: 데이터 보존, membership FK 부여, 고아 참조가 있으면 삭제 없이 중단)를 검증한다. README를 현재 상태로 갱신했다.</w:t>
+      </w:r>
+    </w:p>
+    <w:p>
       <w:r>
         <w:rPr>
           <w:rFonts w:ascii="Arial" w:hAnsi="Arial" w:eastAsia="Malgun Gothic" w:cs="Malgun Gothic"/>

</xml_diff>